<commit_message>
docs: actualiza la documentación de la Entrega 2 a la migración 013
Co-Authored-By: Claude Opus 5.5 <noreply@anthropic.com>
</commit_message>
<xml_diff>
--- a/base-de-datos/documentacion/Entrega1_REDA.docx
+++ b/base-de-datos/documentacion/Entrega1_REDA.docx
@@ -105,7 +105,7 @@
           <w:sz w:val="22"/>
           <w:szCs w:val="22"/>
         </w:rPr>
-        <w:t xml:space="preserve">Integrantes: [Nombre 1], [Nombre 2], [Nombre 3], [Nombre 4]</w:t>
+        <w:t>Integrantes: Rafael Alfonso Rivera Restrepo, Ivan Andres Rodriguez Rodriguez, Luis Eliecer Mendoza Perpiñan, Carlos Eduardo Camelo Montaño.</w:t>
       </w:r>
     </w:p>
     <w:p>
@@ -6167,7 +6167,7 @@
           <w:sz w:val="24"/>
           <w:szCs w:val="24"/>
         </w:rPr>
-        <w:t xml:space="preserve">El repositorio del proyecto se encuentra en: [PEGAR AQUÍ EL ENLACE DE GITHUB, ej. https://github.com/usuario/reda].</w:t>
+        <w:t>El repositorio del proyecto se encuentra en: https://github.com/luismendoza009/REDA-Red-de-Evaluacion-y-Detecci-n-de-Riesgos-Urbanos.</w:t>
       </w:r>
     </w:p>
     <w:p>

</xml_diff>